<commit_message>
fix(release): regenerate v0.2.0 exports after ADR-0003 header cleanup
</commit_message>
<xml_diff>
--- a/exports/docx/sections/Chapter-02/section-01.ar.docx
+++ b/exports/docx/sections/Chapter-02/section-01.ar.docx
@@ -15,7 +15,7 @@
         <w:drawing>
           <wp:inline>
             <wp:extent cx="7560000" cy="10692000"/>
-            <wp:docPr id="27" name="Picture 27"/>
+            <wp:docPr id="26" name="Picture 26"/>
             <wp:cNvGraphicFramePr>
               <a:graphicFrameLocks noChangeAspect="1"/>
             </wp:cNvGraphicFramePr>
@@ -57,12 +57,31 @@
         <w:t xml:space="preserve">AI-Assisted Professional Engineering with .NET</w:t>
       </w:r>
     </w:p>
-    <w:bookmarkStart w:id="21" w:name="section"/>
+    <w:bookmarkStart w:id="32" w:name="Xbd406eb17da21a604e43eba5d1b7287cc950355"/>
+    <w:p>
+      <w:pPr>
+        <w:pStyle w:val="Heading1"/>
+        <w:bidi/>
+      </w:pPr>
+      <w:r>
+        <w:rPr>
+          <w:rtl/>
+        </w:rPr>
+        <w:t xml:space="preserve">القسم الأول — ما الذي يفعله النموذج اللغوي الكبير فعلاً: الرموز والتضمينات والسياق والاستدلال</w:t>
+      </w:r>
+    </w:p>
+    <w:bookmarkStart w:id="21" w:name="الآلية-خلف-الواجهة"/>
     <w:p>
       <w:pPr>
         <w:pStyle w:val="Heading2"/>
         <w:bidi/>
       </w:pPr>
+      <w:r>
+        <w:rPr>
+          <w:rtl/>
+        </w:rPr>
+        <w:t xml:space="preserve">الآلية خلف الواجهة</w:t>
+      </w:r>
     </w:p>
     <w:p>
       <w:pPr>
@@ -72,118 +91,7 @@
         <w:rPr>
           <w:rtl/>
         </w:rPr>
-        <w:t xml:space="preserve">chapter: 02</w:t>
-      </w:r>
-      <w:r>
-        <w:rPr>
-          <w:rtl/>
-        </w:rPr>
-        <w:t xml:space="preserve"> </w:t>
-      </w:r>
-      <w:r>
-        <w:rPr>
-          <w:rtl/>
-        </w:rPr>
-        <w:t xml:space="preserve">section: 01</w:t>
-      </w:r>
-      <w:r>
-        <w:rPr>
-          <w:rtl/>
-        </w:rPr>
-        <w:t xml:space="preserve"> </w:t>
-      </w:r>
-      <w:r>
-        <w:rPr>
-          <w:rtl/>
-        </w:rPr>
-        <w:t xml:space="preserve">title:</w:t>
-      </w:r>
-      <w:r>
-        <w:rPr>
-          <w:rtl/>
-        </w:rPr>
-        <w:t xml:space="preserve"> </w:t>
-      </w:r>
-      <w:r>
-        <w:rPr>
-          <w:rtl/>
-        </w:rPr>
-        <w:t xml:space="preserve">“ما الذي يفعله النموذج اللغوي الكبير فعلاً: الرموز والتضمينات والسياق والاستدلال”</w:t>
-      </w:r>
-      <w:r>
-        <w:rPr>
-          <w:rtl/>
-        </w:rPr>
-        <w:t xml:space="preserve"> </w:t>
-      </w:r>
-      <w:r>
-        <w:rPr>
-          <w:rtl/>
-        </w:rPr>
-        <w:t xml:space="preserve">language: ar</w:t>
-      </w:r>
-      <w:r>
-        <w:rPr>
-          <w:rtl/>
-        </w:rPr>
-        <w:t xml:space="preserve"> </w:t>
-      </w:r>
-      <w:r>
-        <w:rPr>
-          <w:rtl/>
-        </w:rPr>
-        <w:t xml:space="preserve">tags: [llm-mechanics, tokens, embeddings, context-window, inference, dotnet]</w:t>
-      </w:r>
-      <w:r>
-        <w:rPr>
-          <w:rtl/>
-        </w:rPr>
-        <w:t xml:space="preserve"> </w:t>
-      </w:r>
-      <w:r>
-        <w:rPr>
-          <w:rtl/>
-        </w:rPr>
-        <w:t xml:space="preserve">status: validated</w:t>
-      </w:r>
-      <w:r>
-        <w:rPr>
-          <w:rtl/>
-        </w:rPr>
-        <w:t xml:space="preserve"> </w:t>
-      </w:r>
-      <w:r>
-        <w:rPr>
-          <w:rtl/>
-        </w:rPr>
-        <w:t xml:space="preserve">—</w:t>
-      </w:r>
-    </w:p>
-    <w:bookmarkEnd w:id="21"/>
-    <w:bookmarkStart w:id="33" w:name="Xbd406eb17da21a604e43eba5d1b7287cc950355"/>
-    <w:p>
-      <w:pPr>
-        <w:pStyle w:val="Heading1"/>
-        <w:bidi/>
-      </w:pPr>
-      <w:r>
-        <w:rPr>
-          <w:rtl/>
-        </w:rPr>
-        <w:t xml:space="preserve">القسم الأول — ما الذي يفعله النموذج اللغوي الكبير فعلاً: الرموز والتضمينات والسياق والاستدلال</w:t>
-      </w:r>
-    </w:p>
-    <w:bookmarkStart w:id="22" w:name="الآلية-خلف-الواجهة"/>
-    <w:p>
-      <w:pPr>
-        <w:pStyle w:val="Heading2"/>
-        <w:bidi/>
-      </w:pPr>
-      <w:r>
-        <w:rPr>
-          <w:rtl/>
-        </w:rPr>
-        <w:t xml:space="preserve">الآلية خلف الواجهة</w:t>
+        <w:t xml:space="preserve">النموذج اللغوي الكبير - Large Language Model يُنتج كل رمز من خرجه عبر عملية تنبؤ واحدة مُكرَّرة: معطيات تمثّل النص حتى اللحظة الراهنة، وتوزيع احتمالي على الرمز التالي، وأخذ عينة من ذلك التوزيع، وإلحاق الرمز المُنتَج بالمتتالية ثم الإعادة. هذه هي آلية التوليد بأكملها — لا توجد خطوة تخطيط مستقلة، ولا تمثيل داخلي للمشكلة، ولا عملية تشبه الاسترجاع من قاعدة بيانات. كل شيء آخر — مظهر الاستدلال، ومظهر الطلاقة، ومفردات المعمارية، والكود الذي يبدو صحيحاً — هو ما تُنتجه هذه الآلية حين تكون الأرقام تمثيلاً للغة وحين يكون النموذج قد دُرِّب على مجموعة ضخمة من النصوص البشرية.</w:t>
       </w:r>
     </w:p>
     <w:p>
@@ -194,7 +102,7 @@
         <w:rPr>
           <w:rtl/>
         </w:rPr>
-        <w:t xml:space="preserve">النموذج اللغوي الكبير - Large Language Model يُنتج كل رمز من خرجه عبر عملية تنبؤ واحدة مُكرَّرة: معطيات تمثّل النص حتى اللحظة الراهنة، وتوزيع احتمالي على الرمز التالي، وأخذ عينة من ذلك التوزيع، وإلحاق الرمز المُنتَج بالمتتالية ثم الإعادة. هذه هي آلية التوليد بأكملها — لا توجد خطوة تخطيط مستقلة، ولا تمثيل داخلي للمشكلة، ولا عملية تشبه الاسترجاع من قاعدة بيانات. كل شيء آخر — مظهر الاستدلال، ومظهر الطلاقة، ومفردات المعمارية، والكود الذي يبدو صحيحاً — هو ما تُنتجه هذه الآلية حين تكون الأرقام تمثيلاً للغة وحين يكون النموذج قد دُرِّب على مجموعة ضخمة من النصوص البشرية.</w:t>
+        <w:t xml:space="preserve">يصطدم مهندس .NET للمرة الأولى بهذا النموذج بشيء مألوف في مظهره ومُربك في جوهره: يُرسل طلباً فيعود إليه رد، والرد نص — كود C# صحيح نحوياً في أغلب الأحيان، أو تحليل معماري سليم البنية، أو صياغة تحمل نفس مستوى الدقة التقنية التي يتوقعها من زميل أول في جلسة مراجعة تصميم. كل الحدس المبني على سنوات من العمل مع أنظمة حتمية - Deterministic Systems يوحي بأن ثمة شيئاً تحت السطح يُنتج هذا الخرج بطريقة تشبه طريقة الخدمة حين تُنتج استجابةً: تمثيل داخلي للمشكلة، واسترجاع للحقائق ذات الصلة، وعملية تشبه التفكير. لكن الآلية الحقيقية مختلفة جوهرياً — وهي موضوع هذا القسم.</w:t>
       </w:r>
     </w:p>
     <w:p>
@@ -205,22 +113,11 @@
         <w:rPr>
           <w:rtl/>
         </w:rPr>
-        <w:t xml:space="preserve">يصطدم مهندس .NET للمرة الأولى بهذا النموذج بشيء مألوف في مظهره ومُربك في جوهره: يُرسل طلباً فيعود إليه رد، والرد نص — كود C# صحيح نحوياً في أغلب الأحيان، أو تحليل معماري سليم البنية، أو صياغة تحمل نفس مستوى الدقة التقنية التي يتوقعها من زميل أول في جلسة مراجعة تصميم. كل الحدس المبني على سنوات من العمل مع أنظمة حتمية - Deterministic Systems يوحي بأن ثمة شيئاً تحت السطح يُنتج هذا الخرج بطريقة تشبه طريقة الخدمة حين تُنتج استجابةً: تمثيل داخلي للمشكلة، واسترجاع للحقائق ذات الصلة، وعملية تشبه التفكير. لكن الآلية الحقيقية مختلفة جوهرياً — وهي موضوع هذا القسم.</w:t>
+        <w:t xml:space="preserve">يبني هذا القسم تلك الآلية من الأساس، مستخدماً مفردات وأطراً تنسجم مع المفاهيم التي يملك مهندس .NET حدساً عملياً بشأنها: التسلسل والبحث في القواميس - Dictionary Lookup والمخازن المؤقتة ذات الحجم الثابت - Fixed-Size Buffers واستدعاءات الدوال. الهدف ليس الاكتمال الرياضي — بل نموذج ذهني دقيق بما يكفي لجعل السلوكيات التي يفحصها بقية هذا الفصل تبدو نتائج طبيعية متوقعة، لا مجرد مفاجآت عشوائية.</w:t>
       </w:r>
     </w:p>
-    <w:p>
-      <w:pPr>
-        <w:bidi/>
-      </w:pPr>
-      <w:r>
-        <w:rPr>
-          <w:rtl/>
-        </w:rPr>
-        <w:t xml:space="preserve">يبني هذا القسم تلك الآلية من الأساس، مستخدماً مفردات وأطراً تنسجم مع المفاهيم التي يملك مهندس .NET حدساً عملياً بشأنها: التسلسل والبحث في القواميس - Dictionary Lookup والمخازن المؤقتة ذات الحجم الثابت - Fixed-Size Buffers واستدعاءات الدوال. الهدف ليس الاكتمال الرياضي — بل نموذج ذهني دقيق بما يكفي لجعل السلوكيات التي يفحصها بقية هذا الفصل تبدو نتائج طبيعية متوقعة، لا مجرد مفاجآت عشوائية.</w:t>
-      </w:r>
-    </w:p>
-    <w:bookmarkEnd w:id="22"/>
-    <w:bookmarkStart w:id="26" w:name="الرموز---tokens-وحدة-كل-شيء"/>
+    <w:bookmarkEnd w:id="21"/>
+    <w:bookmarkStart w:id="25" w:name="الرموز---tokens-وحدة-كل-شيء"/>
     <w:p>
       <w:pPr>
         <w:pStyle w:val="Heading2"/>
@@ -372,18 +269,18 @@
           <wp:inline>
             <wp:extent cx="5892800" cy="466012"/>
             <wp:effectExtent b="0" l="0" r="0" t="0"/>
-            <wp:docPr descr="Diagram: dg-15260a450414" title="" id="24" name="Picture"/>
+            <wp:docPr descr="Diagram: dg-15260a450414" title="" id="23" name="Picture"/>
             <a:graphic>
               <a:graphicData uri="http://schemas.openxmlformats.org/drawingml/2006/picture">
                 <pic:pic>
                   <pic:nvPicPr>
-                    <pic:cNvPr descr="exports\diagrams\mermaid\dg-15260a450414.png" id="25" name="Picture"/>
+                    <pic:cNvPr descr="exports\diagrams\mermaid\dg-15260a450414.png" id="24" name="Picture"/>
                     <pic:cNvPicPr>
                       <a:picLocks noChangeArrowheads="1" noChangeAspect="1"/>
                     </pic:cNvPicPr>
                   </pic:nvPicPr>
                   <pic:blipFill>
-                    <a:blip r:embed="rId23"/>
+                    <a:blip r:embed="rId22"/>
                     <a:stretch>
                       <a:fillRect/>
                     </a:stretch>
@@ -433,8 +330,8 @@
         <w:t xml:space="preserve">المخطط يمثّل الحلقة التوليدية الكاملة. كل مربع مهم للقرارات الهندسية التي يتناولها هذا الفصل، لكن الحلقة ذاتها — ولا سيما سهم التغذية الراجعة من أخذ العينات - Sampling إلى طبقات المحوّل - Transformer Layers — هي الحقيقة البنيوية الأهم المتعلقة بكيفية عمل هذه الأنظمة. النموذج لا يُنتج استجابة ثم يتوقف ليقيّمها. إنه يُنتج رمزاً واحداً، يُضيف ذلك الرمز إلى مدخلاته الخاصة، ويُعيد تشغيل التمرير الأمامي - Forward Pass بأكمله مرة أخرى. نموذج يُولّد استجابة من خمسمئة رمز لسؤال معماري يُنفّذ خمسمئة تمرير أمامي كاملاً، كل منها مشروط بكل ما جاء قبله — بما في ذلك رموزه الأولى السابقة، صحيحةً كانت أم لا.</w:t>
       </w:r>
     </w:p>
-    <w:bookmarkEnd w:id="26"/>
-    <w:bookmarkStart w:id="27" w:name="Xea74f3b088630cf5878065e90424d756f4740cf"/>
+    <w:bookmarkEnd w:id="25"/>
+    <w:bookmarkStart w:id="26" w:name="Xea74f3b088630cf5878065e90424d756f4740cf"/>
     <w:p>
       <w:pPr>
         <w:pStyle w:val="Heading2"/>
@@ -649,8 +546,8 @@
         <w:t xml:space="preserve">“هذا المعرّف يبدو فحسب كالمعرّفات القريبة منه في فضاء التضمين.”</w:t>
       </w:r>
     </w:p>
-    <w:bookmarkEnd w:id="27"/>
-    <w:bookmarkStart w:id="28" w:name="X846c95a96af3ddf778d58fcbe954851dded0a68"/>
+    <w:bookmarkEnd w:id="26"/>
+    <w:bookmarkStart w:id="27" w:name="X846c95a96af3ddf778d58fcbe954851dded0a68"/>
     <w:p>
       <w:pPr>
         <w:pStyle w:val="Heading2"/>
@@ -768,8 +665,8 @@
         <w:t xml:space="preserve">- Lost in the Middle.</w:t>
       </w:r>
     </w:p>
-    <w:bookmarkEnd w:id="28"/>
-    <w:bookmarkStart w:id="29" w:name="X4fc70fa2a9d85e8818ff12611fffe4e6875dc20"/>
+    <w:bookmarkEnd w:id="27"/>
+    <w:bookmarkStart w:id="28" w:name="X4fc70fa2a9d85e8818ff12611fffe4e6875dc20"/>
     <w:p>
       <w:pPr>
         <w:pStyle w:val="Heading2"/>
@@ -1974,8 +1871,8 @@
         <w:t xml:space="preserve">تشغيل الكود أعلاه ضد الموجّه ذاته عدة مرات — حتى عند درجة حرارة منخفضة ثابتة — قد يُنتج متتاليات رموز مختلفة بفروق دقيقة: فخطوة أخذ العينات تُدخل مصدر تباين حقيقياً لا نظير له في استدعاء دالة .NET معتادة. ومهندس اعتاد كتابة اختبارات وحدة تُؤكّد المساواة النصية الدقيقة لقيمة مُرجَعة سيجد أن هذا الافتراض لا ينتقل إلى المخرجات المُولَّدة بالذكاء الاصطناعي دون قرار معماري صريح حول مقدار التباين المقبول وكيفية اكتشافه — وهو ما يعود إليه هذا الفصل مباشرةً في معالجة القسم الخامس للأنظمة الحتمية مقابل الاحتمالية.</w:t>
       </w:r>
     </w:p>
-    <w:bookmarkEnd w:id="29"/>
-    <w:bookmarkStart w:id="30" w:name="ما-لا-تحتويه-هذه-الآلية"/>
+    <w:bookmarkEnd w:id="28"/>
+    <w:bookmarkStart w:id="29" w:name="ما-لا-تحتويه-هذه-الآلية"/>
     <w:p>
       <w:pPr>
         <w:pStyle w:val="Heading2"/>
@@ -2117,8 +2014,8 @@
         <w:t xml:space="preserve">وهذا ليس قيداً يمكن لهندسة الموجّه - Prompt Engineering أن تتجاوزه بالكامل، وليس قيداً ستُزيله النماذج الأكبر بالضرورة — إنه البنية ذاتها. كل ما يُستكشَف في بقية هذا الفصل — لماذا تبدو النماذج وكأنها تستدل، وأين ينهار ذلك الاستدلال الظاهري، ولماذا الهلوسة - Hallucination بنيوية وليست عَرَضية، وما يبدو عليه التعامل المُعايَر والحذر مع المخرجات — يتبع مباشرةً من الآلية الموصوفة في هذا القسم.</w:t>
       </w:r>
     </w:p>
-    <w:bookmarkEnd w:id="30"/>
-    <w:bookmarkStart w:id="31" w:name="Xf024e1e7d0db218aa3c7b2d1634843105e81507"/>
+    <w:bookmarkEnd w:id="29"/>
+    <w:bookmarkStart w:id="30" w:name="Xf024e1e7d0db218aa3c7b2d1634843105e81507"/>
     <w:p>
       <w:pPr>
         <w:pStyle w:val="Heading2"/>
@@ -2236,8 +2133,8 @@
         <w:t xml:space="preserve">— إنه يُنتج توزيعاً احتمالياً في كلتا الحالتين، والفرق بين الحالتين هو في الأرجحيات النسبية للرموز المختلفة، لا في أي علم صريح يمكن استفساره. هذا هو السبب الجوهري وراء كون الثقة المُعبَّر عنها في مخرجات النموذج — النبرة القاطعة، والجمل الحاسمة غير المُتحفِّظة — مُولَّدةً كأرجح الرموز في سياق تتضمن نصوصاً تقنية واثقة النبرة، لا مشتقةً من أي تقييم داخلي لصحة المحتوى المتاخم. القسمان الثالث والرابع يعودان إلى هذا مباشرةً بتحليل تفصيلي للأنماط التي ينهار فيها الاستدلال الإحصائي وما يبدو عليه ذلك الانهيار من وجهة نظر مهندس .NET يُقيّم مخرجات النموذج.</w:t>
       </w:r>
     </w:p>
-    <w:bookmarkEnd w:id="31"/>
-    <w:bookmarkStart w:id="32" w:name="الأهمية-العملية-لفهم-الآلية"/>
+    <w:bookmarkEnd w:id="30"/>
+    <w:bookmarkStart w:id="31" w:name="الأهمية-العملية-لفهم-الآلية"/>
     <w:p>
       <w:pPr>
         <w:pStyle w:val="Heading2"/>
@@ -2340,8 +2237,8 @@
         <w:t xml:space="preserve">هذه الاعتبارات الثلاثة لا تُضاف إلى القائمة من باب الاستيفاء النظري — هي التطبيق المباشر للآلية المشروحة في هذا القسم على قرارات تصميم خدمات .NET مدمجة بالذكاء الاصطناعي. القسم التالي يبني عليها بطرح السؤال المكمّل: إذا كانت الآلية مجرد تنبؤ بالرمز التالي عبر متتالية، فمن أين يأتي الإيهام الإقناعي بالفهم والاستدلال الذي يُشاهده المهندس في كثير من مخرجاته؟</w:t>
       </w:r>
     </w:p>
+    <w:bookmarkEnd w:id="31"/>
     <w:bookmarkEnd w:id="32"/>
-    <w:bookmarkEnd w:id="33"/>
     <w:p>
       <w:pPr>
         <w:spacing w:before="0" w:after="0" w:line="240" w:lineRule="auto"/>
@@ -2351,7 +2248,7 @@
         <w:drawing>
           <wp:inline>
             <wp:extent cx="7560000" cy="10692000"/>
-            <wp:docPr id="26" name="Picture 26"/>
+            <wp:docPr id="25" name="Picture 25"/>
             <wp:cNvGraphicFramePr>
               <a:graphicFrameLocks noChangeAspect="1"/>
             </wp:cNvGraphicFramePr>

</xml_diff>